<commit_message>
Fix Mermaid DrawingML so Word opens it (correct namespaces + AlternateContent)
The generated diagrams used non-existent namespace URIs
(openxmlformats.org/drawingml/2006/wordprocessing{Shape,Group}); Word rejected
the file with "experienced an error trying to open the file". Use the real
Office 2010 namespaces (schemas.microsoft.com/office/word/2010/wordprocessing
{Shape,Group}) and wrap the drawing in mc:AlternateContent / mc:Choice
Requires="wpg", matching what Word itself emits. Connector geometry is now
straightConnector1.

load.rs: treat mc:AlternateContent as a raw-preserving run child, otherwise the
diagram was dropped when reloading the .docx.

Verified in real Word (COM probe + screenshot): assets/sample.docx opens cleanly
with 3 equations and the flowchart rendered as native shapes + arrow connectors.

Co-Authored-By: Claude Opus 4.8 (1M context) <noreply@anthropic.com>
</commit_message>
<xml_diff>
--- a/assets/sample.docx
+++ b/assets/sample.docx
@@ -584,233 +584,238 @@
         <w:jc w:val="center"/>
       </w:pPr>
       <w:r>
-        <w:drawing>
-          <wp:inline xmlns:wp="http://schemas.openxmlformats.org/drawingml/2006/wordprocessingDrawing" distT="0" distB="0" distL="0" distR="0">
-            <wp:extent cx="4882896" cy="1188720"/>
-            <wp:effectExtent l="0" t="0" r="0" b="0"/>
-            <wp:docPr id="1" name="Mermaid Diagram" descr="mermaid:flowchart LR\n  A[Markdown] --&gt; B[docxcore]\n  B --&gt; C[Word .docx]\n  B --&gt; D[PDF]"/>
-            <wp:cNvGraphicFramePr/>
-            <a:graphic xmlns:a="http://schemas.openxmlformats.org/drawingml/2006/main">
-              <a:graphicData uri="http://schemas.openxmlformats.org/drawingml/2006/wordprocessingGroup">
-                <wpg:wgp xmlns:wpg="http://schemas.openxmlformats.org/drawingml/2006/wordprocessingGroup" xmlns:wps="http://schemas.openxmlformats.org/drawingml/2006/wordprocessingShape">
-                  <wpg:cNvGrpSpPr/>
-                  <wpg:grpSpPr>
-                    <a:xfrm>
-                      <a:off x="0" y="0"/>
-                      <a:ext cx="4882896" cy="1188720"/>
-                      <a:chOff x="0" y="0"/>
-                      <a:chExt cx="4882896" cy="1188720"/>
-                    </a:xfrm>
-                  </wpg:grpSpPr>
-                  <wps:wsp>
-                    <wps:cNvPr id="2" name="Edge 2"/>
-                    <wps:cNvCnPr/>
-                    <wps:spPr>
-                      <a:xfrm>
-                        <a:off x="1024128" y="228600"/>
-                        <a:ext cx="822960" cy="1"/>
-                      </a:xfrm>
-                      <a:prstGeom prst="line">
-                        <a:avLst/>
-                      </a:prstGeom>
-                      <a:ln w="12700">
-                        <a:solidFill>
-                          <a:srgbClr val="333333"/>
-                        </a:solidFill>
-                        <a:tailEnd type="triangle"/>
-                      </a:ln>
-                    </wps:spPr>
-                    <wps:bodyPr/>
-                  </wps:wsp>
-                  <wps:wsp>
-                    <wps:cNvPr id="3" name="Edge 3"/>
-                    <wps:cNvCnPr/>
-                    <wps:spPr>
-                      <a:xfrm>
-                        <a:off x="2871216" y="228600"/>
-                        <a:ext cx="822960" cy="1"/>
-                      </a:xfrm>
-                      <a:prstGeom prst="line">
-                        <a:avLst/>
-                      </a:prstGeom>
-                      <a:ln w="12700">
-                        <a:solidFill>
-                          <a:srgbClr val="333333"/>
-                        </a:solidFill>
-                        <a:tailEnd type="triangle"/>
-                      </a:ln>
-                    </wps:spPr>
-                    <wps:bodyPr/>
-                  </wps:wsp>
-                  <wps:wsp>
-                    <wps:cNvPr id="4" name="Edge 4"/>
-                    <wps:cNvCnPr/>
-                    <wps:spPr>
-                      <a:xfrm>
-                        <a:off x="2871216" y="228600"/>
-                        <a:ext cx="960120" cy="731520"/>
-                      </a:xfrm>
-                      <a:prstGeom prst="line">
-                        <a:avLst/>
-                      </a:prstGeom>
-                      <a:ln w="12700">
-                        <a:solidFill>
-                          <a:srgbClr val="333333"/>
-                        </a:solidFill>
-                        <a:tailEnd type="triangle"/>
-                      </a:ln>
-                    </wps:spPr>
-                    <wps:bodyPr/>
-                  </wps:wsp>
-                  <wps:wsp>
-                    <wps:cNvPr id="5" name="Node 5"/>
-                    <wps:cNvSpPr/>
-                    <wps:spPr>
-                      <a:xfrm>
-                        <a:off x="0" y="0"/>
-                        <a:ext cx="1024128" cy="457200"/>
-                      </a:xfrm>
-                      <a:prstGeom prst="rect">
-                        <a:avLst/>
-                      </a:prstGeom>
-                      <a:solidFill>
-                        <a:srgbClr val="DAE8FC"/>
-                      </a:solidFill>
-                      <a:ln w="9525">
-                        <a:solidFill>
-                          <a:srgbClr val="6C8EBF"/>
-                        </a:solidFill>
-                      </a:ln>
-                    </wps:spPr>
-                    <wps:txbx>
-                      <w:txbxContent>
-                        <w:p>
-                          <w:pPr>
-                            <w:jc w:val="center"/>
-                          </w:pPr>
-                          <w:r>
-                            <w:t xml:space="preserve">Markdown</w:t>
-                          </w:r>
-                        </w:p>
-                      </w:txbxContent>
-                    </wps:txbx>
-                    <wps:bodyPr rot="0" anchor="ctr">
-                      <a:noAutofit/>
-                    </wps:bodyPr>
-                  </wps:wsp>
-                  <wps:wsp>
-                    <wps:cNvPr id="6" name="Node 6"/>
-                    <wps:cNvSpPr/>
-                    <wps:spPr>
-                      <a:xfrm>
-                        <a:off x="1847088" y="0"/>
-                        <a:ext cx="1024128" cy="457200"/>
-                      </a:xfrm>
-                      <a:prstGeom prst="rect">
-                        <a:avLst/>
-                      </a:prstGeom>
-                      <a:solidFill>
-                        <a:srgbClr val="DAE8FC"/>
-                      </a:solidFill>
-                      <a:ln w="9525">
-                        <a:solidFill>
-                          <a:srgbClr val="6C8EBF"/>
-                        </a:solidFill>
-                      </a:ln>
-                    </wps:spPr>
-                    <wps:txbx>
-                      <w:txbxContent>
-                        <w:p>
-                          <w:pPr>
-                            <w:jc w:val="center"/>
-                          </w:pPr>
-                          <w:r>
-                            <w:t xml:space="preserve">docxcore</w:t>
-                          </w:r>
-                        </w:p>
-                      </w:txbxContent>
-                    </wps:txbx>
-                    <wps:bodyPr rot="0" anchor="ctr">
-                      <a:noAutofit/>
-                    </wps:bodyPr>
-                  </wps:wsp>
-                  <wps:wsp>
-                    <wps:cNvPr id="7" name="Node 7"/>
-                    <wps:cNvSpPr/>
-                    <wps:spPr>
-                      <a:xfrm>
-                        <a:off x="3694176" y="0"/>
-                        <a:ext cx="1188720" cy="457200"/>
-                      </a:xfrm>
-                      <a:prstGeom prst="rect">
-                        <a:avLst/>
-                      </a:prstGeom>
-                      <a:solidFill>
-                        <a:srgbClr val="DAE8FC"/>
-                      </a:solidFill>
-                      <a:ln w="9525">
-                        <a:solidFill>
-                          <a:srgbClr val="6C8EBF"/>
-                        </a:solidFill>
-                      </a:ln>
-                    </wps:spPr>
-                    <wps:txbx>
-                      <w:txbxContent>
-                        <w:p>
-                          <w:pPr>
-                            <w:jc w:val="center"/>
-                          </w:pPr>
-                          <w:r>
-                            <w:t xml:space="preserve">Word .docx</w:t>
-                          </w:r>
-                        </w:p>
-                      </w:txbxContent>
-                    </wps:txbx>
-                    <wps:bodyPr rot="0" anchor="ctr">
-                      <a:noAutofit/>
-                    </wps:bodyPr>
-                  </wps:wsp>
-                  <wps:wsp>
-                    <wps:cNvPr id="8" name="Node 8"/>
-                    <wps:cNvSpPr/>
-                    <wps:spPr>
-                      <a:xfrm>
-                        <a:off x="3831336" y="731520"/>
-                        <a:ext cx="914400" cy="457200"/>
-                      </a:xfrm>
-                      <a:prstGeom prst="rect">
-                        <a:avLst/>
-                      </a:prstGeom>
-                      <a:solidFill>
-                        <a:srgbClr val="DAE8FC"/>
-                      </a:solidFill>
-                      <a:ln w="9525">
-                        <a:solidFill>
-                          <a:srgbClr val="6C8EBF"/>
-                        </a:solidFill>
-                      </a:ln>
-                    </wps:spPr>
-                    <wps:txbx>
-                      <w:txbxContent>
-                        <w:p>
-                          <w:pPr>
-                            <w:jc w:val="center"/>
-                          </w:pPr>
-                          <w:r>
-                            <w:t xml:space="preserve">PDF</w:t>
-                          </w:r>
-                        </w:p>
-                      </w:txbxContent>
-                    </wps:txbx>
-                    <wps:bodyPr rot="0" anchor="ctr">
-                      <a:noAutofit/>
-                    </wps:bodyPr>
-                  </wps:wsp>
-                </wpg:wgp>
-              </a:graphicData>
-            </a:graphic>
-          </wp:inline>
-        </w:drawing>
+        <mc:AlternateContent xmlns:mc="http://schemas.openxmlformats.org/markup-compatibility/2006">
+          <mc:Choice xmlns:wpg="http://schemas.microsoft.com/office/word/2010/wordprocessingGroup" Requires="wpg">
+            <w:drawing>
+              <wp:inline xmlns:wp="http://schemas.openxmlformats.org/drawingml/2006/wordprocessingDrawing" distT="0" distB="0" distL="0" distR="0">
+                <wp:extent cx="4882896" cy="1188720"/>
+                <wp:effectExtent l="0" t="0" r="0" b="0"/>
+                <wp:docPr id="1" name="Mermaid Diagram" descr="mermaid:flowchart LR\n  A[Markdown] --&gt; B[docxcore]\n  B --&gt; C[Word .docx]\n  B --&gt; D[PDF]"/>
+                <wp:cNvGraphicFramePr/>
+                <a:graphic xmlns:a="http://schemas.openxmlformats.org/drawingml/2006/main">
+                  <a:graphicData uri="http://schemas.microsoft.com/office/word/2010/wordprocessingGroup">
+                    <wpg:wgp xmlns:wps="http://schemas.microsoft.com/office/word/2010/wordprocessingShape">
+                      <wpg:cNvGrpSpPr/>
+                      <wpg:grpSpPr>
+                        <a:xfrm>
+                          <a:off x="0" y="0"/>
+                          <a:ext cx="4882896" cy="1188720"/>
+                          <a:chOff x="0" y="0"/>
+                          <a:chExt cx="4882896" cy="1188720"/>
+                        </a:xfrm>
+                      </wpg:grpSpPr>
+                      <wps:wsp>
+                        <wps:cNvPr id="2" name="Edge 2"/>
+                        <wps:cNvCnPr/>
+                        <wps:spPr>
+                          <a:xfrm>
+                            <a:off x="1024128" y="228600"/>
+                            <a:ext cx="822960" cy="1"/>
+                          </a:xfrm>
+                          <a:prstGeom prst="straightConnector1">
+                            <a:avLst/>
+                          </a:prstGeom>
+                          <a:ln w="12700">
+                            <a:solidFill>
+                              <a:srgbClr val="333333"/>
+                            </a:solidFill>
+                            <a:tailEnd type="triangle"/>
+                          </a:ln>
+                        </wps:spPr>
+                        <wps:bodyPr/>
+                      </wps:wsp>
+                      <wps:wsp>
+                        <wps:cNvPr id="3" name="Edge 3"/>
+                        <wps:cNvCnPr/>
+                        <wps:spPr>
+                          <a:xfrm>
+                            <a:off x="2871216" y="228600"/>
+                            <a:ext cx="822960" cy="1"/>
+                          </a:xfrm>
+                          <a:prstGeom prst="straightConnector1">
+                            <a:avLst/>
+                          </a:prstGeom>
+                          <a:ln w="12700">
+                            <a:solidFill>
+                              <a:srgbClr val="333333"/>
+                            </a:solidFill>
+                            <a:tailEnd type="triangle"/>
+                          </a:ln>
+                        </wps:spPr>
+                        <wps:bodyPr/>
+                      </wps:wsp>
+                      <wps:wsp>
+                        <wps:cNvPr id="4" name="Edge 4"/>
+                        <wps:cNvCnPr/>
+                        <wps:spPr>
+                          <a:xfrm>
+                            <a:off x="2871216" y="228600"/>
+                            <a:ext cx="960120" cy="731520"/>
+                          </a:xfrm>
+                          <a:prstGeom prst="straightConnector1">
+                            <a:avLst/>
+                          </a:prstGeom>
+                          <a:ln w="12700">
+                            <a:solidFill>
+                              <a:srgbClr val="333333"/>
+                            </a:solidFill>
+                            <a:tailEnd type="triangle"/>
+                          </a:ln>
+                        </wps:spPr>
+                        <wps:bodyPr/>
+                      </wps:wsp>
+                      <wps:wsp>
+                        <wps:cNvPr id="5" name="Node 5"/>
+                        <wps:cNvSpPr/>
+                        <wps:spPr>
+                          <a:xfrm>
+                            <a:off x="0" y="0"/>
+                            <a:ext cx="1024128" cy="457200"/>
+                          </a:xfrm>
+                          <a:prstGeom prst="rect">
+                            <a:avLst/>
+                          </a:prstGeom>
+                          <a:solidFill>
+                            <a:srgbClr val="DAE8FC"/>
+                          </a:solidFill>
+                          <a:ln w="9525">
+                            <a:solidFill>
+                              <a:srgbClr val="6C8EBF"/>
+                            </a:solidFill>
+                          </a:ln>
+                        </wps:spPr>
+                        <wps:txbx>
+                          <w:txbxContent>
+                            <w:p>
+                              <w:pPr>
+                                <w:jc w:val="center"/>
+                              </w:pPr>
+                              <w:r>
+                                <w:t xml:space="preserve">Markdown</w:t>
+                              </w:r>
+                            </w:p>
+                          </w:txbxContent>
+                        </wps:txbx>
+                        <wps:bodyPr rot="0" anchor="ctr">
+                          <a:noAutofit/>
+                        </wps:bodyPr>
+                      </wps:wsp>
+                      <wps:wsp>
+                        <wps:cNvPr id="6" name="Node 6"/>
+                        <wps:cNvSpPr/>
+                        <wps:spPr>
+                          <a:xfrm>
+                            <a:off x="1847088" y="0"/>
+                            <a:ext cx="1024128" cy="457200"/>
+                          </a:xfrm>
+                          <a:prstGeom prst="rect">
+                            <a:avLst/>
+                          </a:prstGeom>
+                          <a:solidFill>
+                            <a:srgbClr val="DAE8FC"/>
+                          </a:solidFill>
+                          <a:ln w="9525">
+                            <a:solidFill>
+                              <a:srgbClr val="6C8EBF"/>
+                            </a:solidFill>
+                          </a:ln>
+                        </wps:spPr>
+                        <wps:txbx>
+                          <w:txbxContent>
+                            <w:p>
+                              <w:pPr>
+                                <w:jc w:val="center"/>
+                              </w:pPr>
+                              <w:r>
+                                <w:t xml:space="preserve">docxcore</w:t>
+                              </w:r>
+                            </w:p>
+                          </w:txbxContent>
+                        </wps:txbx>
+                        <wps:bodyPr rot="0" anchor="ctr">
+                          <a:noAutofit/>
+                        </wps:bodyPr>
+                      </wps:wsp>
+                      <wps:wsp>
+                        <wps:cNvPr id="7" name="Node 7"/>
+                        <wps:cNvSpPr/>
+                        <wps:spPr>
+                          <a:xfrm>
+                            <a:off x="3694176" y="0"/>
+                            <a:ext cx="1188720" cy="457200"/>
+                          </a:xfrm>
+                          <a:prstGeom prst="rect">
+                            <a:avLst/>
+                          </a:prstGeom>
+                          <a:solidFill>
+                            <a:srgbClr val="DAE8FC"/>
+                          </a:solidFill>
+                          <a:ln w="9525">
+                            <a:solidFill>
+                              <a:srgbClr val="6C8EBF"/>
+                            </a:solidFill>
+                          </a:ln>
+                        </wps:spPr>
+                        <wps:txbx>
+                          <w:txbxContent>
+                            <w:p>
+                              <w:pPr>
+                                <w:jc w:val="center"/>
+                              </w:pPr>
+                              <w:r>
+                                <w:t xml:space="preserve">Word .docx</w:t>
+                              </w:r>
+                            </w:p>
+                          </w:txbxContent>
+                        </wps:txbx>
+                        <wps:bodyPr rot="0" anchor="ctr">
+                          <a:noAutofit/>
+                        </wps:bodyPr>
+                      </wps:wsp>
+                      <wps:wsp>
+                        <wps:cNvPr id="8" name="Node 8"/>
+                        <wps:cNvSpPr/>
+                        <wps:spPr>
+                          <a:xfrm>
+                            <a:off x="3831336" y="731520"/>
+                            <a:ext cx="914400" cy="457200"/>
+                          </a:xfrm>
+                          <a:prstGeom prst="rect">
+                            <a:avLst/>
+                          </a:prstGeom>
+                          <a:solidFill>
+                            <a:srgbClr val="DAE8FC"/>
+                          </a:solidFill>
+                          <a:ln w="9525">
+                            <a:solidFill>
+                              <a:srgbClr val="6C8EBF"/>
+                            </a:solidFill>
+                          </a:ln>
+                        </wps:spPr>
+                        <wps:txbx>
+                          <w:txbxContent>
+                            <w:p>
+                              <w:pPr>
+                                <w:jc w:val="center"/>
+                              </w:pPr>
+                              <w:r>
+                                <w:t xml:space="preserve">PDF</w:t>
+                              </w:r>
+                            </w:p>
+                          </w:txbxContent>
+                        </wps:txbx>
+                        <wps:bodyPr rot="0" anchor="ctr">
+                          <a:noAutofit/>
+                        </wps:bodyPr>
+                      </wps:wsp>
+                    </wpg:wgp>
+                  </a:graphicData>
+                </a:graphic>
+              </wp:inline>
+            </w:drawing>
+          </mc:Choice>
+          <mc:Fallback/>
+        </mc:AlternateContent>
       </w:r>
     </w:p>
     <w:p>

</xml_diff>